<commit_message>
update figures and manuscripts
</commit_message>
<xml_diff>
--- a/InternshipDocs/Manuscript/Manuscript_draft_07302026_V1.docx
+++ b/InternshipDocs/Manuscript/Manuscript_draft_07302026_V1.docx
@@ -930,6 +930,7 @@
       </w:r>
     </w:p>
     <w:p/>
+    <w:p/>
     <w:p>
       <w:r>
         <w:rPr>
@@ -937,7 +938,7 @@
         </w:rPr>
         <w:lastRenderedPageBreak/>
         <w:drawing>
-          <wp:inline distT="0" distB="0" distL="0" distR="0" wp14:anchorId="15CC99CE" wp14:editId="5EA33C54">
+          <wp:inline distT="0" distB="0" distL="0" distR="0" wp14:anchorId="15CC99CE" wp14:editId="00BA10CD">
             <wp:extent cx="7390090" cy="4702629"/>
             <wp:effectExtent l="0" t="0" r="1905" b="3175"/>
             <wp:docPr id="441169667" name="Picture 10"/>
@@ -987,7 +988,7 @@
         </w:rPr>
         <w:lastRenderedPageBreak/>
         <w:drawing>
-          <wp:inline distT="0" distB="0" distL="0" distR="0" wp14:anchorId="01DD16C8" wp14:editId="3914663E">
+          <wp:inline distT="0" distB="0" distL="0" distR="0" wp14:anchorId="01DD16C8" wp14:editId="289BEC04">
             <wp:extent cx="7429500" cy="5943600"/>
             <wp:effectExtent l="0" t="0" r="0" b="0"/>
             <wp:docPr id="910013566" name="Picture 11"/>
@@ -1174,7 +1175,7 @@
         </w:rPr>
         <w:lastRenderedPageBreak/>
         <w:drawing>
-          <wp:inline distT="0" distB="0" distL="0" distR="0" wp14:anchorId="4889F313" wp14:editId="6F3EF0AD">
+          <wp:inline distT="0" distB="0" distL="0" distR="0" wp14:anchorId="4889F313" wp14:editId="1E57C7E2">
             <wp:extent cx="4928260" cy="3832863"/>
             <wp:effectExtent l="0" t="0" r="5715" b="0"/>
             <wp:docPr id="881441025" name="Picture 5"/>
@@ -1527,9 +1528,9 @@
         </w:rPr>
         <w:lastRenderedPageBreak/>
         <w:drawing>
-          <wp:inline distT="0" distB="0" distL="0" distR="0" wp14:anchorId="0DC5653E" wp14:editId="76F5284A">
-            <wp:extent cx="5547360" cy="5943600"/>
-            <wp:effectExtent l="0" t="0" r="0" b="0"/>
+          <wp:inline distT="0" distB="0" distL="0" distR="0" wp14:anchorId="0DC5653E" wp14:editId="272E8E2F">
+            <wp:extent cx="5396753" cy="5782236"/>
+            <wp:effectExtent l="0" t="0" r="0" b="9525"/>
             <wp:docPr id="301013250" name="Picture 3"/>
             <wp:cNvGraphicFramePr>
               <a:graphicFrameLocks xmlns:a="http://schemas.openxmlformats.org/drawingml/2006/main" noChangeAspect="1"/>
@@ -1556,7 +1557,7 @@
                   <pic:spPr>
                     <a:xfrm>
                       <a:off x="0" y="0"/>
-                      <a:ext cx="5547360" cy="5943600"/>
+                      <a:ext cx="5413450" cy="5800126"/>
                     </a:xfrm>
                     <a:prstGeom prst="rect">
                       <a:avLst/>
@@ -1671,7 +1672,7 @@
         </w:rPr>
         <w:lastRenderedPageBreak/>
         <w:drawing>
-          <wp:inline distT="0" distB="0" distL="0" distR="0" wp14:anchorId="5CD971F9" wp14:editId="1CF64815">
+          <wp:inline distT="0" distB="0" distL="0" distR="0" wp14:anchorId="5CD971F9" wp14:editId="0F99E7A1">
             <wp:extent cx="7263338" cy="3026391"/>
             <wp:effectExtent l="0" t="0" r="0" b="3175"/>
             <wp:docPr id="203263506" name="Picture 15"/>
@@ -1802,8 +1803,8 @@
         </w:rPr>
         <w:lastRenderedPageBreak/>
         <w:drawing>
-          <wp:inline distT="0" distB="0" distL="0" distR="0" wp14:anchorId="4899DD81" wp14:editId="3339B51B">
-            <wp:extent cx="7132320" cy="6768935"/>
+          <wp:inline distT="0" distB="0" distL="0" distR="0" wp14:anchorId="4899DD81" wp14:editId="31A1CC7C">
+            <wp:extent cx="5549153" cy="5266429"/>
             <wp:effectExtent l="0" t="0" r="0" b="0"/>
             <wp:docPr id="1525393589" name="Picture 16"/>
             <wp:cNvGraphicFramePr>
@@ -1831,7 +1832,7 @@
                   <pic:spPr>
                     <a:xfrm>
                       <a:off x="0" y="0"/>
-                      <a:ext cx="7137623" cy="6773967"/>
+                      <a:ext cx="5568312" cy="5284612"/>
                     </a:xfrm>
                     <a:prstGeom prst="rect">
                       <a:avLst/>
@@ -1846,29 +1847,29 @@
     </w:p>
     <w:p>
       <w:r>
+        <w:t>Figure 5d.</w:t>
+      </w:r>
+      <w:r>
+        <w:t xml:space="preserve"> </w:t>
+      </w:r>
+      <w:r>
+        <w:t xml:space="preserve">The parameter estimation accuracy of </w:t>
+      </w:r>
+      <w:proofErr w:type="spellStart"/>
+      <w:r>
+        <w:t>vae</w:t>
+      </w:r>
+      <w:proofErr w:type="spellEnd"/>
+      <w:r>
+        <w:t>-based covariate selection in nlmixr2</w:t>
+      </w:r>
+    </w:p>
+    <w:p>
+      <w:r>
+        <w:rPr>
+          <w:noProof/>
+        </w:rPr>
         <w:lastRenderedPageBreak/>
-        <w:t>Figure 5d.</w:t>
-      </w:r>
-      <w:r>
-        <w:t xml:space="preserve"> </w:t>
-      </w:r>
-      <w:r>
-        <w:t xml:space="preserve">The parameter estimation accuracy of </w:t>
-      </w:r>
-      <w:proofErr w:type="spellStart"/>
-      <w:r>
-        <w:t>vae</w:t>
-      </w:r>
-      <w:proofErr w:type="spellEnd"/>
-      <w:r>
-        <w:t>-based covariate selection in nlmixr2</w:t>
-      </w:r>
-    </w:p>
-    <w:p>
-      <w:r>
-        <w:rPr>
-          <w:noProof/>
-        </w:rPr>
         <w:drawing>
           <wp:inline distT="0" distB="0" distL="0" distR="0" wp14:anchorId="390B8168" wp14:editId="09705145">
             <wp:extent cx="7486650" cy="3972661"/>

</xml_diff>